<commit_message>
Corrige acentuacao ausente nos calendarios de julho (Instagram/WhatsApp)
Varias palavras tinham sido escritas sem acento por engano. Revisado
palavra por palavra e regenerado docx/pdf.

Co-Authored-By: Claude Sonnet 5 <noreply@anthropic.com>
</commit_message>
<xml_diff>
--- a/camila-sartori/calendario-fonte/calendario-instagram-julho.docx
+++ b/camila-sartori/calendario-fonte/calendario-instagram-julho.docx
@@ -39,7 +39,7 @@
                 <w:color w:val="FFFFFF"/>
                 <w:sz w:val="23"/>
               </w:rPr>
-              <w:t>SEMANA 3 · 20 a 26/07, Crencas limitantes</w:t>
+              <w:t>SEMANA 3 · 20 a 26/07, Crenças limitantes</w:t>
             </w:r>
           </w:p>
         </w:tc>
@@ -73,7 +73,7 @@
                 <w:color w:val="FFFFFF"/>
                 <w:sz w:val="21"/>
               </w:rPr>
-              <w:t>📅  22/07 (QUA), Post estatico</w:t>
+              <w:t>📅  22/07 (QUA), Post estático</w:t>
             </w:r>
           </w:p>
         </w:tc>
@@ -116,7 +116,7 @@
                 <w:color w:val="FFFFFF"/>
                 <w:sz w:val="20"/>
               </w:rPr>
-              <w:t>⏰ 09h   [ INSTAGRAM ]   💬 ENGAJAMENTO (Automacao -&gt; Grupo VIP)</w:t>
+              <w:t>⏰ 09h   [ INSTAGRAM ]   💬 ENGAJAMENTO (Automação -&gt; Grupo VIP)</w:t>
             </w:r>
           </w:p>
         </w:tc>
@@ -156,7 +156,7 @@
                 <w:i w:val="0"/>
                 <w:sz w:val="18"/>
               </w:rPr>
-              <w:t>Post estatico (imagem + texto)</w:t>
+              <w:t>Post estático (imagem + texto)</w:t>
             </w:r>
           </w:p>
           <w:p>
@@ -177,7 +177,7 @@
                 <w:i w:val="0"/>
                 <w:sz w:val="21"/>
               </w:rPr>
-              <w:t>Voce nao e "dramatica". Voce so nunca teve espaco pra sentir o que sente.</w:t>
+              <w:t>Você não é "dramática". Você só nunca teve espaço pra sentir o que sente.</w:t>
             </w:r>
           </w:p>
           <w:p>
@@ -219,7 +219,7 @@
                 <w:i w:val="0"/>
                 <w:sz w:val="19"/>
               </w:rPr>
-              <w:t>Quantas vezes te disseram que voce estava exagerando, sendo dramatica ou dando importancia demais para alguma coisa? E nunca te ensinaram a entender esse sentimento, apenas esconde-lo. O que fica escondido nao desaparece. Ele transborda de outra forma, atraves de uma ansiedade, uma autocritica, um comportamento repetitivo, dificuldade de confiar. Se voce quer aprender a quebrar esses padroes de uma vez por todas e ter mais qualidade de vida, comente AUTOCONHECIMENTO e olha o que eu vou te enviar no seu direct.</w:t>
+              <w:t>Quantas vezes te disseram que você estava exagerando, sendo dramática ou dando importância demais para alguma coisa? E nunca te ensinaram a entender esse sentimento, apenas escondê-lo. O que fica escondido não desaparece. Ele transborda de outra forma, através de uma ansiedade, uma autocrítica, um comportamento repetitivo, dificuldade de confiar. Se você quer aprender a quebrar esses padrões de uma vez por todas e ter mais qualidade de vida, comente AUTOCONHECIMENTO e olha o que eu vou te enviar no seu direct.</w:t>
             </w:r>
           </w:p>
           <w:p>
@@ -342,7 +342,7 @@
                 <w:color w:val="FFFFFF"/>
                 <w:sz w:val="20"/>
               </w:rPr>
-              <w:t>⏰ 09h   [ INSTAGRAM ]   💬 VALOR + ENGAJAMENTO (Automacao -&gt; Grupo VIP)</w:t>
+              <w:t>⏰ 09h   [ INSTAGRAM ]   💬 VALOR + ENGAJAMENTO (Automação -&gt; Grupo VIP)</w:t>
             </w:r>
           </w:p>
         </w:tc>
@@ -422,7 +422,7 @@
                 <w:i w:val="0"/>
                 <w:sz w:val="19"/>
               </w:rPr>
-              <w:t>Momento autoconhecimento: sera que voce realmente se conhece?</w:t>
+              <w:t>Momento autoconhecimento: será que você realmente se conhece?</w:t>
             </w:r>
             <w:r>
               <w:br/>
@@ -473,7 +473,7 @@
                 <w:i w:val="0"/>
                 <w:sz w:val="19"/>
               </w:rPr>
-              <w:t>SIM ou NAO: voce ja perdeu a conta de quantas vezes disse "depois eu falo" e nunca falou?</w:t>
+              <w:t>SIM ou NÃO: você já perdeu a conta de quantas vezes disse "depois eu falo" e nunca falou?</w:t>
             </w:r>
           </w:p>
           <w:p>
@@ -505,7 +505,7 @@
                 <w:i w:val="0"/>
                 <w:sz w:val="19"/>
               </w:rPr>
-              <w:t>SIM ou NAO: voce pede desculpa ate quando nao fez nada de errado?</w:t>
+              <w:t>SIM ou NÃO: você pede desculpa até quando não fez nada de errado?</w:t>
             </w:r>
           </w:p>
           <w:p>
@@ -537,7 +537,7 @@
                 <w:i w:val="0"/>
                 <w:sz w:val="19"/>
               </w:rPr>
-              <w:t>SIM ou NAO: voce ja ensaiou uma resposta 10 vezes na cabeca e nao teve coragem de mandar?</w:t>
+              <w:t>SIM ou NÃO: você já ensaiou uma resposta 10 vezes na cabeça e não teve coragem de mandar?</w:t>
             </w:r>
           </w:p>
           <w:p>
@@ -569,7 +569,7 @@
                 <w:i w:val="0"/>
                 <w:sz w:val="19"/>
               </w:rPr>
-              <w:t>SIM ou NAO: voce ja ficou horas analisando uma mensagem tentando entender o que a pessoa quis dizer?</w:t>
+              <w:t>SIM ou NÃO: você já ficou horas analisando uma mensagem tentando entender o que a pessoa quis dizer?</w:t>
             </w:r>
           </w:p>
           <w:p>
@@ -601,7 +601,7 @@
                 <w:i w:val="0"/>
                 <w:sz w:val="19"/>
               </w:rPr>
-              <w:t>SIM ou NAO: voce concorda com coisas que nao concorda so para evitar climao?</w:t>
+              <w:t>SIM ou NÃO: você concorda com coisas que não concorda só para evitar climão?</w:t>
             </w:r>
           </w:p>
           <w:p>
@@ -641,7 +641,7 @@
                 <w:i w:val="0"/>
                 <w:sz w:val="19"/>
               </w:rPr>
-              <w:t>Se voce marcou tres ou mais sins, talvez voce tenha crencas limitantes que podem estar sabotando as suas relacoes.</w:t>
+              <w:t>Se você marcou três ou mais sins, talvez você tenha crenças limitantes que podem estar sabotando as suas relações.</w:t>
             </w:r>
             <w:r>
               <w:br/>
@@ -660,7 +660,7 @@
                 <w:i w:val="0"/>
                 <w:sz w:val="19"/>
               </w:rPr>
-              <w:t>A boa noticia e que elas podem ser desconstruidas...</w:t>
+              <w:t>A boa notícia é que elas podem ser desconstruídas...</w:t>
             </w:r>
             <w:r>
               <w:br/>
@@ -679,7 +679,7 @@
                 <w:i w:val="0"/>
                 <w:sz w:val="19"/>
               </w:rPr>
-              <w:t>Se voce quer, de uma vez por todas, quebrar esses padroes e construir uma vida mais tranquila, com mais leveza, te convido para o meu GRUPO VIP, um espaco seguro onde ajudo mulheres como voce a terem mais qualidade de vida atraves do autoconhecimento. Comente: GRUPO VIP, que eu vou te enviar um convite com todos os detalhes no seu direct.</w:t>
+              <w:t>Se você quer, de uma vez por todas, quebrar esses padrões e construir uma vida mais tranquila, com mais leveza, te convido para o meu GRUPO VIP, um espaço seguro onde ajudo mulheres como você a terem mais qualidade de vida através do autoconhecimento. Comente: GRUPO VIP, que eu vou te enviar um convite com todos os detalhes no seu direct.</w:t>
             </w:r>
           </w:p>
           <w:p>
@@ -700,7 +700,7 @@
                 <w:i w:val="0"/>
                 <w:sz w:val="19"/>
               </w:rPr>
-              <w:t>Nao e teste de personalidade, e um convite pra reflexao. Cada SIM que voce marcou pode ser um sinal de que uma crenca limitante esta pesando nas suas decisoes, sem voce perceber. A boa noticia e que ha solucao. Criei um grupo VIP no WhatsApp, onde ajudo mulheres como voce a reconhecer esses padroes, quebra-los, e ter mais qualidade de vida e relacoes mais saudaveis. Comente: GRUPO VIP e eu te envio o convite com todos os detalhes no seu direct.</w:t>
+              <w:t>Não é teste de personalidade, é um convite pra reflexão. Cada SIM que você marcou pode ser um sinal de que uma crença limitante está pesando nas suas decisões, sem você perceber. A boa notícia é que há solução. Criei um grupo VIP no WhatsApp, onde ajudo mulheres como você a reconhecer esses padrões, quebrá-los, e ter mais qualidade de vida e relações mais saudáveis. Comente: GRUPO VIP e eu te envio o convite com todos os detalhes no seu direct.</w:t>
             </w:r>
           </w:p>
           <w:p>
@@ -814,7 +814,7 @@
                 <w:color w:val="FFFFFF"/>
                 <w:sz w:val="21"/>
               </w:rPr>
-              <w:t>📅  29/07 (QUA), Post estatico</w:t>
+              <w:t>📅  29/07 (QUA), Post estático</w:t>
             </w:r>
           </w:p>
         </w:tc>
@@ -857,7 +857,7 @@
                 <w:color w:val="FFFFFF"/>
                 <w:sz w:val="20"/>
               </w:rPr>
-              <w:t>⏰ 09h   [ INSTAGRAM ]   💬 ENGAJAMENTO (Automacao -&gt; Grupo VIP)</w:t>
+              <w:t>⏰ 09h   [ INSTAGRAM ]   💬 ENGAJAMENTO (Automação -&gt; Grupo VIP)</w:t>
             </w:r>
           </w:p>
         </w:tc>
@@ -897,7 +897,7 @@
                 <w:i w:val="0"/>
                 <w:sz w:val="18"/>
               </w:rPr>
-              <w:t>Post estatico (imagem + texto)</w:t>
+              <w:t>Post estático (imagem + texto)</w:t>
             </w:r>
           </w:p>
           <w:p>
@@ -918,7 +918,7 @@
                 <w:i w:val="0"/>
                 <w:sz w:val="21"/>
               </w:rPr>
-              <w:t>Toda vez que voce diz sim pra todo mundo, talvez esteja dizendo nao pra voce mesma.</w:t>
+              <w:t>Toda vez que você diz sim pra todo mundo, talvez esteja dizendo não pra você mesma.</w:t>
             </w:r>
           </w:p>
           <w:p>
@@ -939,7 +939,7 @@
                 <w:i w:val="0"/>
                 <w:sz w:val="19"/>
               </w:rPr>
-              <w:t>Isso nao e uma relacao saudavel, e outra coisa... Leia a legenda.</w:t>
+              <w:t>Isso não é uma relação saudável, é outra coisa... Leia a legenda.</w:t>
             </w:r>
           </w:p>
           <w:p>
@@ -960,7 +960,7 @@
                 <w:i w:val="0"/>
                 <w:sz w:val="19"/>
               </w:rPr>
-              <w:t>Quantas vezes voce disse sim quando queria dizer nao, so pra nao desapontar ninguem? Isso pode ser um padrao aprendido, nao uma virtude, e ele tende a te afastar aos poucos de uma vida que e realmente sua. Se voce precisa dizer sempre "sim" para alguma relacao, seja com a familia, amigos ou seu companheiro, esse tipo de atitude pode se transformar numa relacao toxica e desbalanceada. Em todas as relacoes existem concessoes, mas tambem deveria haver limites. A boa noticia e que da pra aprender a colocar limites sem se sentir culpada. Se voce quer entender mais sobre isso, comente LIMITES e olha o que eu vou te enviar no seu direct.</w:t>
+              <w:t>Quantas vezes você disse sim quando queria dizer não, só pra não desapontar ninguém? Isso pode ser um padrão aprendido, não uma virtude, e ele tende a te afastar aos poucos de uma vida que é realmente sua. Se você precisa dizer sempre "sim" para alguma relação, seja com a família, amigos ou seu companheiro, esse tipo de atitude pode se transformar numa relação tóxica e desbalanceada. Em todas as relações existem concessões, mas também deveria haver limites. A boa notícia é que dá pra aprender a colocar limites sem se sentir culpada. Se você quer entender mais sobre isso, comente LIMITES e olha o que eu vou te enviar no seu direct.</w:t>
             </w:r>
           </w:p>
           <w:p>
@@ -1083,7 +1083,7 @@
                 <w:color w:val="FFFFFF"/>
                 <w:sz w:val="20"/>
               </w:rPr>
-              <w:t>⏰ 09h   [ INSTAGRAM ]   💬 ENGAJAMENTO (Automacao -&gt; presente no direct)</w:t>
+              <w:t>⏰ 09h   [ INSTAGRAM ]   💬 ENGAJAMENTO (Automação -&gt; presente no direct)</w:t>
             </w:r>
           </w:p>
         </w:tc>
@@ -1125,7 +1125,7 @@
                 <w:color w:val="666666"/>
                 <w:sz w:val="17"/>
               </w:rPr>
-              <w:t>Sentada ou em pe no consultorio, boa luz e audio.</w:t>
+              <w:t>Sentada ou em pé no consultório, boa luz e áudio.</w:t>
             </w:r>
           </w:p>
           <w:p>
@@ -1167,7 +1167,7 @@
                 <w:i w:val="0"/>
                 <w:sz w:val="21"/>
               </w:rPr>
-              <w:t>Voce ja reparou que, quando um relacionamento comeca a dar certo de verdade, uma parte de voce fica desconfiada?</w:t>
+              <w:t>Você já reparou que, quando um relacionamento começa a dar certo de verdade, uma parte de você fica desconfiada?</w:t>
             </w:r>
           </w:p>
           <w:p>
@@ -1188,7 +1188,7 @@
                 <w:i w:val="0"/>
                 <w:sz w:val="19"/>
               </w:rPr>
-              <w:t>Roteiro completo: "Voce ja reparou que, quando um relacionamento comeca a dar certo de verdade, uma parte de voce fica desconfiada? Comeca a procurar defeito, a se afastar, ou a testar se a pessoa vai continuar ali mesmo assim? Isso pode nao ser so estar com o pe atras, pode ser um padrao: para quem nunca teve a experiencia de ser tratada bem de forma consistente, carinho sem cobranca pode parecer estranho, quase suspeito. Eu sou Camila Sartori, psicologa e atualmente doutoranda, e trabalho todos os dias ajudando mulheres a entenderem esses padroes nos relacionamentos. Se voce quer aprender mais atraves da minha abordagem, que une terapia do esquema e TCC, comenta VINCULO e eu vou te enviar um presente no seu direct."</w:t>
+              <w:t>Roteiro completo: "Você já reparou que, quando um relacionamento começa a dar certo de verdade, uma parte de você fica desconfiada? Começa a procurar defeito, a se afastar, ou a testar se a pessoa vai continuar ali mesmo assim? Isso pode não ser só estar com o pé atrás, pode ser um padrão: para quem nunca teve a experiência de ser tratada bem de forma consistente, carinho sem cobrança pode parecer estranho, quase suspeito. Eu sou Camila Sartori, psicóloga e atualmente doutoranda, e trabalho todos os dias ajudando mulheres a entenderem esses padrões nos relacionamentos. Se você quer aprender mais através da minha abordagem, que une terapia do esquema e TCC, comenta VÍNCULO e eu vou te enviar um presente no seu direct."</w:t>
             </w:r>
           </w:p>
           <w:p>
@@ -1232,7 +1232,7 @@
                 <w:i w:val="0"/>
                 <w:sz w:val="19"/>
               </w:rPr>
-              <w:t>Se sentir desconfiada quando tudo esta indo bem tambem pode ser um padrao aprendido. Comenta VÍNCULO e eu vou te enviar um presente no seu direct.</w:t>
+              <w:t>Se sentir desconfiada quando tudo está indo bem também pode ser um padrão aprendido. Comenta VÍNCULO e eu vou te enviar um presente no seu direct.</w:t>
             </w:r>
           </w:p>
           <w:p>
@@ -1278,7 +1278,7 @@
                 <w:color w:val="9C1256"/>
                 <w:sz w:val="17"/>
               </w:rPr>
-              <w:t>Assim que postar no Instagram, repostar no grupo do WhatsApp (mesmo video e legenda).</w:t>
+              <w:t>Assim que postar no Instagram, repostar no grupo do WhatsApp (mesmo vídeo e legenda).</w:t>
             </w:r>
           </w:p>
         </w:tc>

</xml_diff>

<commit_message>
Remove pra/pro (usar sempre para/para o) e reescreve roteiro de boas-vindas
Regra de estilo agora vale para todos os clientes: nunca "pra/pro",
sempre "para"/"para o". Reescreve o roteiro do video de boas-vindas do
grupo de WhatsApp com a apresentacao completa da Camila (tempo de
profissao, mestrado, doutoranda, aviso de que o grupo nao substitui
atendimento individual). Ajusta a enquete de 27/07 com nova opcao e
texto de reflexao antes da enquete.

Co-Authored-By: Claude Sonnet 5 <noreply@anthropic.com>
</commit_message>
<xml_diff>
--- a/camila-sartori/calendario-fonte/calendario-instagram-julho.docx
+++ b/camila-sartori/calendario-fonte/calendario-instagram-julho.docx
@@ -177,7 +177,7 @@
                 <w:i w:val="0"/>
                 <w:sz w:val="21"/>
               </w:rPr>
-              <w:t>Você não é "dramática". Você só nunca teve espaço pra sentir o que sente.</w:t>
+              <w:t>Você não é "dramática". Você só nunca teve espaço para sentir o que sente.</w:t>
             </w:r>
           </w:p>
           <w:p>
@@ -441,7 +441,7 @@
                 <w:i w:val="0"/>
                 <w:sz w:val="19"/>
               </w:rPr>
-              <w:t>Arrasta pro lado pra responder as perguntas, e vamos refletir juntas.</w:t>
+              <w:t>Arrasta para o lado para responder as perguntas, e vamos refletir juntas.</w:t>
             </w:r>
           </w:p>
           <w:p>
@@ -700,7 +700,7 @@
                 <w:i w:val="0"/>
                 <w:sz w:val="19"/>
               </w:rPr>
-              <w:t>Não é teste de personalidade, é um convite pra reflexão. Cada SIM que você marcou pode ser um sinal de que uma crença limitante está pesando nas suas decisões, sem você perceber. A boa notícia é que há solução. Criei um grupo VIP no WhatsApp, onde ajudo mulheres como você a reconhecer esses padrões, quebrá-los, e ter mais qualidade de vida e relações mais saudáveis. Comente: GRUPO VIP e eu te envio o convite com todos os detalhes no seu direct.</w:t>
+              <w:t>Não é teste de personalidade, é um convite para reflexão. Cada SIM que você marcou pode ser um sinal de que uma crença limitante está pesando nas suas decisões, sem você perceber. A boa notícia é que há solução. Criei um grupo VIP no WhatsApp, onde ajudo mulheres como você a reconhecer esses padrões, quebrá-los, e ter mais qualidade de vida e relações mais saudáveis. Comente: GRUPO VIP e eu te envio o convite com todos os detalhes no seu direct.</w:t>
             </w:r>
           </w:p>
           <w:p>
@@ -918,7 +918,7 @@
                 <w:i w:val="0"/>
                 <w:sz w:val="21"/>
               </w:rPr>
-              <w:t>Toda vez que você diz sim pra todo mundo, talvez esteja dizendo não pra você mesma.</w:t>
+              <w:t>Toda vez que você diz sim para todo mundo, talvez esteja dizendo não para você mesma.</w:t>
             </w:r>
           </w:p>
           <w:p>
@@ -960,7 +960,7 @@
                 <w:i w:val="0"/>
                 <w:sz w:val="19"/>
               </w:rPr>
-              <w:t>Quantas vezes você disse sim quando queria dizer não, só pra não desapontar ninguém? Isso pode ser um padrão aprendido, não uma virtude, e ele tende a te afastar aos poucos de uma vida que é realmente sua. Se você precisa dizer sempre "sim" para alguma relação, seja com a família, amigos ou seu companheiro, esse tipo de atitude pode se transformar numa relação tóxica e desbalanceada. Em todas as relações existem concessões, mas também deveria haver limites. A boa notícia é que dá pra aprender a colocar limites sem se sentir culpada. Se você quer entender mais sobre isso, comente LIMITES e olha o que eu vou te enviar no seu direct.</w:t>
+              <w:t>Quantas vezes você disse sim quando queria dizer não, só para não desapontar ninguém? Isso pode ser um padrão aprendido, não uma virtude, e ele tende a te afastar aos poucos de uma vida que é realmente sua. Se você precisa dizer sempre "sim" para alguma relação, seja com a família, amigos ou seu companheiro, esse tipo de atitude pode se transformar numa relação tóxica e desbalanceada. Em todas as relações existem concessões, mas também deveria haver limites. A boa notícia é que dá para aprender a colocar limites sem se sentir culpada. Se você quer entender mais sobre isso, comente LIMITES e olha o que eu vou te enviar no seu direct.</w:t>
             </w:r>
           </w:p>
           <w:p>

</xml_diff>